<commit_message>
Full Audio Overhaul spatial audio and everything
</commit_message>
<xml_diff>
--- a/Documentation/Deadend-District_Daily-Work-Log.docx
+++ b/Documentation/Deadend-District_Daily-Work-Log.docx
@@ -103,7 +103,7 @@
           <w:sz w:val="22"/>
           <w:szCs w:val="22"/>
         </w:rPr>
-        <w:t xml:space="preserve">Active development: 5 May – 9 June 2026   ·   22 work days   ·   6 weeks</w:t>
+        <w:t xml:space="preserve">Active development: 5 May – 9 June 2026   ·   23 work days   ·   6 weeks</w:t>
       </w:r>
     </w:p>
     <w:p>
@@ -2479,7 +2479,7 @@
                 <w:sz w:val="20"/>
                 <w:szCs w:val="20"/>
               </w:rPr>
-              <w:t xml:space="preserve">   ·   2 days</w:t>
+              <w:t xml:space="preserve">   ·   3 days</w:t>
             </w:r>
           </w:p>
         </w:tc>
@@ -2667,7 +2667,101 @@
                 <w:sz w:val="20"/>
                 <w:szCs w:val="20"/>
               </w:rPr>
-              <w:t xml:space="preserve">Highscore &amp; pause-menu fix</w:t>
+              <w:t xml:space="preserve">Questline in-game, menus, NPC sprites &amp; highscore</w:t>
+            </w:r>
+          </w:p>
+        </w:tc>
+      </w:tr>
+      <w:tr>
+        <w:tc>
+          <w:tcPr>
+            <w:tcW w:type="dxa" w:w="1050"/>
+            <w:shd w:fill="FFFFFF" w:val="clear"/>
+            <w:tcMar>
+              <w:top w:type="dxa" w:w="50"/>
+              <w:left w:type="dxa" w:w="120"/>
+              <w:bottom w:type="dxa" w:w="50"/>
+              <w:right w:type="dxa" w:w="120"/>
+            </w:tcMar>
+          </w:tcPr>
+          <w:p>
+            <w:r>
+              <w:rPr>
+                <w:rFonts w:ascii="Arial" w:cs="Arial" w:eastAsia="Arial" w:hAnsi="Arial"/>
+                <w:b/>
+                <w:bCs/>
+                <w:color w:val="2E75B6"/>
+                <w:sz w:val="20"/>
+                <w:szCs w:val="20"/>
+              </w:rPr>
+              <w:t xml:space="preserve">Day 23</w:t>
+            </w:r>
+          </w:p>
+        </w:tc>
+        <w:tc>
+          <w:tcPr>
+            <w:tcW w:type="dxa" w:w="1450"/>
+            <w:shd w:fill="FFFFFF" w:val="clear"/>
+            <w:tcMar>
+              <w:top w:type="dxa" w:w="50"/>
+              <w:left w:type="dxa" w:w="120"/>
+              <w:bottom w:type="dxa" w:w="50"/>
+              <w:right w:type="dxa" w:w="120"/>
+            </w:tcMar>
+          </w:tcPr>
+          <w:p>
+            <w:r>
+              <w:rPr>
+                <w:rFonts w:ascii="Arial" w:cs="Arial" w:eastAsia="Arial" w:hAnsi="Arial"/>
+                <w:sz w:val="20"/>
+                <w:szCs w:val="20"/>
+              </w:rPr>
+              <w:t xml:space="preserve">10 Jun</w:t>
+            </w:r>
+          </w:p>
+        </w:tc>
+        <w:tc>
+          <w:tcPr>
+            <w:tcW w:type="dxa" w:w="1500"/>
+            <w:shd w:fill="FFFFFF" w:val="clear"/>
+            <w:tcMar>
+              <w:top w:type="dxa" w:w="50"/>
+              <w:left w:type="dxa" w:w="120"/>
+              <w:bottom w:type="dxa" w:w="50"/>
+              <w:right w:type="dxa" w:w="120"/>
+            </w:tcMar>
+          </w:tcPr>
+          <w:p>
+            <w:r>
+              <w:rPr>
+                <w:rFonts w:ascii="Arial" w:cs="Arial" w:eastAsia="Arial" w:hAnsi="Arial"/>
+                <w:color w:val="595959"/>
+                <w:sz w:val="20"/>
+                <w:szCs w:val="20"/>
+              </w:rPr>
+              <w:t xml:space="preserve">Wednesday</w:t>
+            </w:r>
+          </w:p>
+        </w:tc>
+        <w:tc>
+          <w:tcPr>
+            <w:tcW w:type="dxa" w:w="5360"/>
+            <w:shd w:fill="FFFFFF" w:val="clear"/>
+            <w:tcMar>
+              <w:top w:type="dxa" w:w="50"/>
+              <w:left w:type="dxa" w:w="120"/>
+              <w:bottom w:type="dxa" w:w="50"/>
+              <w:right w:type="dxa" w:w="120"/>
+            </w:tcMar>
+          </w:tcPr>
+          <w:p>
+            <w:r>
+              <w:rPr>
+                <w:rFonts w:ascii="Arial" w:cs="Arial" w:eastAsia="Arial" w:hAnsi="Arial"/>
+                <w:sz w:val="20"/>
+                <w:szCs w:val="20"/>
+              </w:rPr>
+              <w:t xml:space="preserve">Pixelate post-processing &amp; mimic texture</w:t>
             </w:r>
           </w:p>
         </w:tc>
@@ -7997,7 +8091,7 @@
           <w:sz w:val="24"/>
           <w:szCs w:val="24"/>
         </w:rPr>
-        <w:t xml:space="preserve">Highscore &amp; pause-menu fix</w:t>
+        <w:t xml:space="preserve">Questline in-game, menus, NPC sprites &amp; highscore</w:t>
       </w:r>
     </w:p>
     <w:p>
@@ -8010,7 +8104,7 @@
           <w:sz w:val="22"/>
           <w:szCs w:val="22"/>
         </w:rPr>
-        <w:t xml:space="preserve">Added a highscore / run-score system and fixed a major bug where player movement broke the hitboxes of the 3D pause-menu buttons.</w:t>
+        <w:t xml:space="preserve">A large day tying the game loop together. Got the quest system fully working in-game with a complete, playable questline, set up the first quests and their rewards, and added NPC sprites with a billboard effect (sprites always facing the camera) while moving the dialogue UI to the middle of the screen. Added a home menu and a death screen, plus a highscore / run-score system. Adjusted the first-person arms skeleton and fixed two bugs: movement breaking the pause-menu button hitboxes, and camera misalignment when quickly opening the UI.</w:t>
       </w:r>
     </w:p>
     <w:p>
@@ -8044,6 +8138,78 @@
           <w:sz w:val="20"/>
           <w:szCs w:val="20"/>
         </w:rPr>
+        <w:t xml:space="preserve">Quest system set up to work in-game; full questline playable</w:t>
+      </w:r>
+    </w:p>
+    <w:p>
+      <w:pPr>
+        <w:pStyle w:val="ListParagraph"/>
+        <w:numPr>
+          <w:ilvl w:val="0"/>
+          <w:numId w:val="2"/>
+        </w:numPr>
+        <w:spacing w:after="20"/>
+      </w:pPr>
+      <w:r>
+        <w:rPr>
+          <w:rFonts w:ascii="Arial" w:cs="Arial" w:eastAsia="Arial" w:hAnsi="Arial"/>
+          <w:sz w:val="20"/>
+          <w:szCs w:val="20"/>
+        </w:rPr>
+        <w:t xml:space="preserve">First quests set up with rewards</w:t>
+      </w:r>
+    </w:p>
+    <w:p>
+      <w:pPr>
+        <w:pStyle w:val="ListParagraph"/>
+        <w:numPr>
+          <w:ilvl w:val="0"/>
+          <w:numId w:val="2"/>
+        </w:numPr>
+        <w:spacing w:after="20"/>
+      </w:pPr>
+      <w:r>
+        <w:rPr>
+          <w:rFonts w:ascii="Arial" w:cs="Arial" w:eastAsia="Arial" w:hAnsi="Arial"/>
+          <w:sz w:val="20"/>
+          <w:szCs w:val="20"/>
+        </w:rPr>
+        <w:t xml:space="preserve">NPC sprites + billboard effect; dialogue UI moved to the middle of the screen</w:t>
+      </w:r>
+    </w:p>
+    <w:p>
+      <w:pPr>
+        <w:pStyle w:val="ListParagraph"/>
+        <w:numPr>
+          <w:ilvl w:val="0"/>
+          <w:numId w:val="2"/>
+        </w:numPr>
+        <w:spacing w:after="20"/>
+      </w:pPr>
+      <w:r>
+        <w:rPr>
+          <w:rFonts w:ascii="Arial" w:cs="Arial" w:eastAsia="Arial" w:hAnsi="Arial"/>
+          <w:sz w:val="20"/>
+          <w:szCs w:val="20"/>
+        </w:rPr>
+        <w:t xml:space="preserve">Home menu and death screen added</w:t>
+      </w:r>
+    </w:p>
+    <w:p>
+      <w:pPr>
+        <w:pStyle w:val="ListParagraph"/>
+        <w:numPr>
+          <w:ilvl w:val="0"/>
+          <w:numId w:val="2"/>
+        </w:numPr>
+        <w:spacing w:after="20"/>
+      </w:pPr>
+      <w:r>
+        <w:rPr>
+          <w:rFonts w:ascii="Arial" w:cs="Arial" w:eastAsia="Arial" w:hAnsi="Arial"/>
+          <w:sz w:val="20"/>
+          <w:szCs w:val="20"/>
+        </w:rPr>
         <w:t xml:space="preserve">Highscore / run-score system</w:t>
       </w:r>
     </w:p>
@@ -8062,11 +8228,47 @@
           <w:sz w:val="20"/>
           <w:szCs w:val="20"/>
         </w:rPr>
+        <w:t xml:space="preserve">Arms skeleton adjustment</w:t>
+      </w:r>
+    </w:p>
+    <w:p>
+      <w:pPr>
+        <w:pStyle w:val="ListParagraph"/>
+        <w:numPr>
+          <w:ilvl w:val="0"/>
+          <w:numId w:val="2"/>
+        </w:numPr>
+        <w:spacing w:after="20"/>
+      </w:pPr>
+      <w:r>
+        <w:rPr>
+          <w:rFonts w:ascii="Arial" w:cs="Arial" w:eastAsia="Arial" w:hAnsi="Arial"/>
+          <w:sz w:val="20"/>
+          <w:szCs w:val="20"/>
+        </w:rPr>
         <w:t xml:space="preserve">Fix: movement no longer breaks the pause-menu button hitboxes</w:t>
       </w:r>
     </w:p>
     <w:p>
       <w:pPr>
+        <w:pStyle w:val="ListParagraph"/>
+        <w:numPr>
+          <w:ilvl w:val="0"/>
+          <w:numId w:val="2"/>
+        </w:numPr>
+        <w:spacing w:after="20"/>
+      </w:pPr>
+      <w:r>
+        <w:rPr>
+          <w:rFonts w:ascii="Arial" w:cs="Arial" w:eastAsia="Arial" w:hAnsi="Arial"/>
+          <w:sz w:val="20"/>
+          <w:szCs w:val="20"/>
+        </w:rPr>
+        <w:t xml:space="preserve">Fix: camera misalignment when quickly using the UI</w:t>
+      </w:r>
+    </w:p>
+    <w:p>
+      <w:pPr>
         <w:spacing w:after="40" w:before="100"/>
       </w:pPr>
       <w:r>
@@ -8097,6 +8299,44 @@
           <w:sz w:val="20"/>
           <w:szCs w:val="20"/>
         </w:rPr>
+        <w:t xml:space="preserve">Inventory/LootItemSO.cs</w:t>
+      </w:r>
+    </w:p>
+    <w:p>
+      <w:pPr>
+        <w:pStyle w:val="ListParagraph"/>
+        <w:numPr>
+          <w:ilvl w:val="0"/>
+          <w:numId w:val="3"/>
+        </w:numPr>
+        <w:spacing w:after="20"/>
+      </w:pPr>
+      <w:r>
+        <w:rPr>
+          <w:rFonts w:ascii="Arial" w:cs="Arial" w:eastAsia="Arial" w:hAnsi="Arial"/>
+          <w:color w:val="595959"/>
+          <w:sz w:val="20"/>
+          <w:szCs w:val="20"/>
+        </w:rPr>
+        <w:t xml:space="preserve">World/Billboard.cs</w:t>
+      </w:r>
+    </w:p>
+    <w:p>
+      <w:pPr>
+        <w:pStyle w:val="ListParagraph"/>
+        <w:numPr>
+          <w:ilvl w:val="0"/>
+          <w:numId w:val="3"/>
+        </w:numPr>
+        <w:spacing w:after="20"/>
+      </w:pPr>
+      <w:r>
+        <w:rPr>
+          <w:rFonts w:ascii="Arial" w:cs="Arial" w:eastAsia="Arial" w:hAnsi="Arial"/>
+          <w:color w:val="595959"/>
+          <w:sz w:val="20"/>
+          <w:szCs w:val="20"/>
+        </w:rPr>
         <w:t xml:space="preserve">UI/RunScoreUI.cs</w:t>
       </w:r>
     </w:p>
@@ -8136,6 +8376,112 @@
           <w:szCs w:val="20"/>
         </w:rPr>
         <w:t xml:space="preserve">UI/MenuSystem/Editor/MenuButtonColliderFitter.cs</w:t>
+      </w:r>
+    </w:p>
+    <w:p>
+      <w:pPr>
+        <w:pStyle w:val="Heading2"/>
+        <w:spacing w:after="30" w:before="200"/>
+      </w:pPr>
+      <w:r>
+        <w:rPr>
+          <w:b/>
+          <w:bCs/>
+          <w:color w:val="1F3864"/>
+        </w:rPr>
+        <w:t xml:space="preserve">Day 23</w:t>
+      </w:r>
+      <w:r>
+        <w:rPr>
+          <w:b/>
+          <w:bCs/>
+          <w:color w:val="000000"/>
+        </w:rPr>
+        <w:t xml:space="preserve">  —  Wednesday, 10 June 2026</w:t>
+      </w:r>
+    </w:p>
+    <w:p>
+      <w:pPr>
+        <w:pBdr>
+          <w:bottom w:val="single" w:color="D9E2F3" w:sz="6" w:space="4"/>
+        </w:pBdr>
+        <w:spacing w:after="120"/>
+      </w:pPr>
+      <w:r>
+        <w:rPr>
+          <w:rFonts w:ascii="Arial" w:cs="Arial" w:eastAsia="Arial" w:hAnsi="Arial"/>
+          <w:b/>
+          <w:bCs/>
+          <w:color w:val="2E75B6"/>
+          <w:sz w:val="24"/>
+          <w:szCs w:val="24"/>
+        </w:rPr>
+        <w:t xml:space="preserve">Pixelate post-processing &amp; mimic texture</w:t>
+      </w:r>
+    </w:p>
+    <w:p>
+      <w:pPr>
+        <w:spacing w:after="140"/>
+      </w:pPr>
+      <w:r>
+        <w:rPr>
+          <w:rFonts w:ascii="Arial" w:cs="Arial" w:eastAsia="Arial" w:hAnsi="Arial"/>
+          <w:sz w:val="22"/>
+          <w:szCs w:val="22"/>
+        </w:rPr>
+        <w:t xml:space="preserve">Added a pixelate post-processing effect to give the game its stylised look, and applied a texture to the Mimic monster.</w:t>
+      </w:r>
+    </w:p>
+    <w:p>
+      <w:pPr>
+        <w:spacing w:after="40"/>
+      </w:pPr>
+      <w:r>
+        <w:rPr>
+          <w:rFonts w:ascii="Arial" w:cs="Arial" w:eastAsia="Arial" w:hAnsi="Arial"/>
+          <w:b/>
+          <w:bCs/>
+          <w:color w:val="1F3864"/>
+          <w:sz w:val="20"/>
+          <w:szCs w:val="20"/>
+        </w:rPr>
+        <w:t xml:space="preserve">What was done</w:t>
+      </w:r>
+    </w:p>
+    <w:p>
+      <w:pPr>
+        <w:pStyle w:val="ListParagraph"/>
+        <w:numPr>
+          <w:ilvl w:val="0"/>
+          <w:numId w:val="2"/>
+        </w:numPr>
+        <w:spacing w:after="20"/>
+      </w:pPr>
+      <w:r>
+        <w:rPr>
+          <w:rFonts w:ascii="Arial" w:cs="Arial" w:eastAsia="Arial" w:hAnsi="Arial"/>
+          <w:sz w:val="20"/>
+          <w:szCs w:val="20"/>
+        </w:rPr>
+        <w:t xml:space="preserve">Pixelate post-processing effect added</w:t>
+      </w:r>
+    </w:p>
+    <w:p>
+      <w:pPr>
+        <w:pStyle w:val="ListParagraph"/>
+        <w:numPr>
+          <w:ilvl w:val="0"/>
+          <w:numId w:val="2"/>
+        </w:numPr>
+        <w:spacing w:after="20"/>
+      </w:pPr>
+      <w:r>
+        <w:rPr>
+          <w:rFonts w:ascii="Arial" w:cs="Arial" w:eastAsia="Arial" w:hAnsi="Arial"/>
+          <w:sz w:val="20"/>
+          <w:szCs w:val="20"/>
+        </w:rPr>
+        <w:t xml:space="preserve">Mimic monster texture added</w:t>
       </w:r>
     </w:p>
     <w:sectPr>

</xml_diff>